<commit_message>
fix(templates): remove tag profissao_contratante e padroniza ordem de assinatura (Contratado -> Contratante) nos modelos de exclusividade
</commit_message>
<xml_diff>
--- a/templates/exclusividade_sem_conjuge_mista_2_testemunhas.docx
+++ b/templates/exclusividade_sem_conjuge_mista_2_testemunhas.docx
@@ -26,7 +26,7 @@
           <w:sz w:val="24"/>
           <w:szCs w:val="24"/>
         </w:rPr>
-        <w:t xml:space="preserve">: NOME: {contratante}, ESTADO CIVIL: {estado_civil_contratante}, PROFISSÃO: {profissao_contratante}, </w:t>
+        <w:t xml:space="preserve">: NOME: {contratante}, ESTADO CIVIL: {estado_civil_contratante}, </w:t>
       </w:r>
       <w:proofErr w:type="gramStart"/>
       <w:r>
@@ -1035,7 +1035,7 @@
           <w:sz w:val="24"/>
           <w:szCs w:val="24"/>
         </w:rPr>
-        <w:t>CONTRATANTE - {contratante}</w:t>
+        <w:t>{NOME_PAPEL_CONTRATADO} - {contratado}</w:t>
       </w:r>
     </w:p>
     <w:p>
@@ -1054,7 +1054,7 @@
           <w:sz w:val="24"/>
           <w:szCs w:val="24"/>
         </w:rPr>
-        <w:t>CPF nº {cpf_contratante}</w:t>
+        <w:t>CPF nº {cpf_contratado}</w:t>
       </w:r>
     </w:p>
     <w:p>
@@ -1169,7 +1169,7 @@
           <w:sz w:val="24"/>
           <w:szCs w:val="24"/>
         </w:rPr>
-        <w:t>{NOME_PAPEL_CONTRATADO} - {</w:t>
+        <w:t>CONTRATANTE - {contratante}</w:t>
       </w:r>
       <w:proofErr w:type="spellStart"/>
       <w:r>
@@ -1178,7 +1178,6 @@
           <w:sz w:val="24"/>
           <w:szCs w:val="24"/>
         </w:rPr>
-        <w:t>contratado</w:t>
       </w:r>
       <w:proofErr w:type="spellEnd"/>
       <w:r>
@@ -1187,7 +1186,6 @@
           <w:sz w:val="24"/>
           <w:szCs w:val="24"/>
         </w:rPr>
-        <w:t>}</w:t>
       </w:r>
     </w:p>
     <w:p>
@@ -1206,7 +1204,7 @@
           <w:sz w:val="24"/>
           <w:szCs w:val="24"/>
         </w:rPr>
-        <w:t>CPF nº {cpf_contratado}</w:t>
+        <w:t>CPF nº {cpf_contratante}</w:t>
       </w:r>
     </w:p>
     <w:p>

</xml_diff>